<commit_message>
Final revision to Project_Topic_Document_Chappelle_Aidan.docx
</commit_message>
<xml_diff>
--- a/Project/Documentation/Project_Topic_Document_Chappelle_Aidan.docx
+++ b/Project/Documentation/Project_Topic_Document_Chappelle_Aidan.docx
@@ -125,7 +125,10 @@
           </w:tcPr>
           <w:p>
             <w:r>
-              <w:t>Aidan Chappelle</w:t>
+              <w:t>Connor</w:t>
+            </w:r>
+            <w:r>
+              <w:t xml:space="preserve"> Chappelle</w:t>
             </w:r>
           </w:p>
         </w:tc>
@@ -147,7 +150,10 @@
           </w:tcPr>
           <w:p>
             <w:r>
-              <w:t>Connor Chappelle</w:t>
+              <w:t>Aidan</w:t>
+            </w:r>
+            <w:r>
+              <w:t xml:space="preserve"> Chappelle</w:t>
             </w:r>
           </w:p>
         </w:tc>
@@ -248,8 +254,13 @@
           </w:tcPr>
           <w:p/>
           <w:p>
-            <w:r>
-              <w:t>Brescian Blue</w:t>
+            <w:proofErr w:type="spellStart"/>
+            <w:r>
+              <w:t>Brescian</w:t>
+            </w:r>
+            <w:proofErr w:type="spellEnd"/>
+            <w:r>
+              <w:t xml:space="preserve"> Blue</w:t>
             </w:r>
           </w:p>
           <w:p/>
@@ -296,34 +307,16 @@
           <w:p/>
           <w:p>
             <w:r>
-              <w:t>This application will allow the user to read</w:t>
-            </w:r>
-            <w:r>
-              <w:t xml:space="preserve"> and enter</w:t>
-            </w:r>
-            <w:r>
-              <w:t xml:space="preserve"> timings for motorsport races and information such as sector times, lap times, driver names and positions, and race duration</w:t>
-            </w:r>
-            <w:r>
-              <w:t>.</w:t>
-            </w:r>
-            <w:r>
-              <w:t xml:space="preserve"> Up to 24 drivers can be measured.</w:t>
-            </w:r>
-            <w:r>
-              <w:t xml:space="preserve"> The application will calculate the delta differences between positions based on their respective times</w:t>
-            </w:r>
-            <w:r>
-              <w:t>. The user can also look up drivers and see</w:t>
-            </w:r>
-            <w:r>
-              <w:t xml:space="preserve"> specific</w:t>
-            </w:r>
-            <w:r>
-              <w:t xml:space="preserve"> details about their performance</w:t>
-            </w:r>
-            <w:r>
-              <w:t>.</w:t>
+              <w:t>This application will allow the user to read and enter timings for motorsport races, including information such as sector times, lap times, driver names, track name and layout, car class, leaderboard positions, track conditions, weather,</w:t>
+            </w:r>
+            <w:r>
+              <w:t xml:space="preserve"> number of laps,</w:t>
+            </w:r>
+            <w:r>
+              <w:t xml:space="preserve"> flags thrown,</w:t>
+            </w:r>
+            <w:r>
+              <w:t xml:space="preserve"> and race duration. Up to 12 drivers can be measured. The application will calculate the delta differences between positions based on their respective times. The user can also look up drivers and see specific details about their performance.</w:t>
             </w:r>
           </w:p>
           <w:p/>
@@ -446,9 +439,11 @@
             <w:tcW w:w="2350" w:type="dxa"/>
           </w:tcPr>
           <w:p>
-            <w:r>
-              <w:t>matchDate</w:t>
-            </w:r>
+            <w:proofErr w:type="spellStart"/>
+            <w:r>
+              <w:t>raceDate</w:t>
+            </w:r>
+            <w:proofErr w:type="spellEnd"/>
           </w:p>
         </w:tc>
         <w:tc>
@@ -467,7 +462,16 @@
           </w:tcPr>
           <w:p>
             <w:r>
-              <w:t>Date match played</w:t>
+              <w:t xml:space="preserve">Date </w:t>
+            </w:r>
+            <w:r>
+              <w:t>of race</w:t>
+            </w:r>
+            <w:r>
+              <w:t xml:space="preserve"> </w:t>
+            </w:r>
+            <w:r>
+              <w:t>event</w:t>
             </w:r>
           </w:p>
         </w:tc>
@@ -478,12 +482,14 @@
             <w:tcW w:w="2350" w:type="dxa"/>
           </w:tcPr>
           <w:p>
+            <w:proofErr w:type="spellStart"/>
             <w:r>
               <w:t>createdDate</w:t>
             </w:r>
             <w:r>
               <w:t>Time</w:t>
             </w:r>
+            <w:proofErr w:type="spellEnd"/>
           </w:p>
         </w:tc>
         <w:tc>
@@ -513,9 +519,14 @@
             <w:tcW w:w="2350" w:type="dxa"/>
           </w:tcPr>
           <w:p>
-            <w:r>
-              <w:t>player1Name</w:t>
-            </w:r>
+            <w:proofErr w:type="spellStart"/>
+            <w:r>
+              <w:t>driverName</w:t>
+            </w:r>
+            <w:r>
+              <w:t>s</w:t>
+            </w:r>
+            <w:proofErr w:type="spellEnd"/>
           </w:p>
         </w:tc>
         <w:tc>
@@ -532,7 +543,17 @@
           <w:tcPr>
             <w:tcW w:w="4813" w:type="dxa"/>
           </w:tcPr>
-          <w:p/>
+          <w:p>
+            <w:r>
+              <w:t>Names</w:t>
+            </w:r>
+            <w:r>
+              <w:t xml:space="preserve"> of drivers </w:t>
+            </w:r>
+            <w:r>
+              <w:t>in race</w:t>
+            </w:r>
+          </w:p>
         </w:tc>
       </w:tr>
       <w:tr>
@@ -541,9 +562,11 @@
             <w:tcW w:w="2350" w:type="dxa"/>
           </w:tcPr>
           <w:p>
-            <w:r>
-              <w:t>player2Name</w:t>
-            </w:r>
+            <w:proofErr w:type="spellStart"/>
+            <w:r>
+              <w:t>weatherConditions</w:t>
+            </w:r>
+            <w:proofErr w:type="spellEnd"/>
           </w:p>
         </w:tc>
         <w:tc>
@@ -560,7 +583,14 @@
           <w:tcPr>
             <w:tcW w:w="4813" w:type="dxa"/>
           </w:tcPr>
-          <w:p/>
+          <w:p>
+            <w:r>
+              <w:t>W</w:t>
+            </w:r>
+            <w:r>
+              <w:t>eather conditions of the race day</w:t>
+            </w:r>
+          </w:p>
         </w:tc>
       </w:tr>
       <w:tr>
@@ -569,9 +599,11 @@
             <w:tcW w:w="2350" w:type="dxa"/>
           </w:tcPr>
           <w:p>
-            <w:r>
-              <w:t>player1Game1Score</w:t>
-            </w:r>
+            <w:proofErr w:type="spellStart"/>
+            <w:r>
+              <w:t>trackName</w:t>
+            </w:r>
+            <w:proofErr w:type="spellEnd"/>
           </w:p>
         </w:tc>
         <w:tc>
@@ -580,6 +612,313 @@
           </w:tcPr>
           <w:p>
             <w:r>
+              <w:t>String</w:t>
+            </w:r>
+          </w:p>
+        </w:tc>
+        <w:tc>
+          <w:tcPr>
+            <w:tcW w:w="4813" w:type="dxa"/>
+          </w:tcPr>
+          <w:p>
+            <w:r>
+              <w:t>Name of track being raced</w:t>
+            </w:r>
+          </w:p>
+        </w:tc>
+      </w:tr>
+      <w:tr>
+        <w:tc>
+          <w:tcPr>
+            <w:tcW w:w="2350" w:type="dxa"/>
+          </w:tcPr>
+          <w:p>
+            <w:proofErr w:type="spellStart"/>
+            <w:r>
+              <w:t>numberOfLaps</w:t>
+            </w:r>
+            <w:proofErr w:type="spellEnd"/>
+          </w:p>
+        </w:tc>
+        <w:tc>
+          <w:tcPr>
+            <w:tcW w:w="2187" w:type="dxa"/>
+          </w:tcPr>
+          <w:p>
+            <w:r>
+              <w:t>i</w:t>
+            </w:r>
+            <w:r>
+              <w:t>nt</w:t>
+            </w:r>
+          </w:p>
+        </w:tc>
+        <w:tc>
+          <w:tcPr>
+            <w:tcW w:w="4813" w:type="dxa"/>
+          </w:tcPr>
+          <w:p>
+            <w:r>
+              <w:t>How many laps the race will run</w:t>
+            </w:r>
+          </w:p>
+        </w:tc>
+      </w:tr>
+      <w:tr>
+        <w:tc>
+          <w:tcPr>
+            <w:tcW w:w="2350" w:type="dxa"/>
+          </w:tcPr>
+          <w:p>
+            <w:proofErr w:type="spellStart"/>
+            <w:r>
+              <w:t>raceDurationHours</w:t>
+            </w:r>
+            <w:proofErr w:type="spellEnd"/>
+          </w:p>
+        </w:tc>
+        <w:tc>
+          <w:tcPr>
+            <w:tcW w:w="2187" w:type="dxa"/>
+          </w:tcPr>
+          <w:p>
+            <w:r>
+              <w:t>double</w:t>
+            </w:r>
+          </w:p>
+        </w:tc>
+        <w:tc>
+          <w:tcPr>
+            <w:tcW w:w="4813" w:type="dxa"/>
+          </w:tcPr>
+          <w:p>
+            <w:r>
+              <w:t>How long the race lasted in hours</w:t>
+            </w:r>
+          </w:p>
+        </w:tc>
+      </w:tr>
+      <w:tr>
+        <w:tc>
+          <w:tcPr>
+            <w:tcW w:w="2350" w:type="dxa"/>
+          </w:tcPr>
+          <w:p>
+            <w:proofErr w:type="spellStart"/>
+            <w:r>
+              <w:t>driverTimes</w:t>
+            </w:r>
+            <w:proofErr w:type="spellEnd"/>
+          </w:p>
+        </w:tc>
+        <w:tc>
+          <w:tcPr>
+            <w:tcW w:w="2187" w:type="dxa"/>
+          </w:tcPr>
+          <w:p>
+            <w:r>
+              <w:t>double</w:t>
+            </w:r>
+          </w:p>
+        </w:tc>
+        <w:tc>
+          <w:tcPr>
+            <w:tcW w:w="4813" w:type="dxa"/>
+          </w:tcPr>
+          <w:p>
+            <w:r>
+              <w:t>List</w:t>
+            </w:r>
+            <w:r>
+              <w:t xml:space="preserve"> of driver times</w:t>
+            </w:r>
+          </w:p>
+        </w:tc>
+      </w:tr>
+      <w:tr>
+        <w:tc>
+          <w:tcPr>
+            <w:tcW w:w="2350" w:type="dxa"/>
+          </w:tcPr>
+          <w:p>
+            <w:proofErr w:type="spellStart"/>
+            <w:r>
+              <w:t>carClass</w:t>
+            </w:r>
+            <w:proofErr w:type="spellEnd"/>
+          </w:p>
+        </w:tc>
+        <w:tc>
+          <w:tcPr>
+            <w:tcW w:w="2187" w:type="dxa"/>
+          </w:tcPr>
+          <w:p>
+            <w:r>
+              <w:t>String</w:t>
+            </w:r>
+          </w:p>
+        </w:tc>
+        <w:tc>
+          <w:tcPr>
+            <w:tcW w:w="4813" w:type="dxa"/>
+          </w:tcPr>
+          <w:p>
+            <w:r>
+              <w:t>Class of cars being raced (LMH, GT,</w:t>
+            </w:r>
+            <w:r>
+              <w:t xml:space="preserve"> F1,</w:t>
+            </w:r>
+            <w:r>
+              <w:t xml:space="preserve"> etc.)</w:t>
+            </w:r>
+          </w:p>
+        </w:tc>
+      </w:tr>
+      <w:tr>
+        <w:tc>
+          <w:tcPr>
+            <w:tcW w:w="2350" w:type="dxa"/>
+          </w:tcPr>
+          <w:p>
+            <w:proofErr w:type="spellStart"/>
+            <w:r>
+              <w:t>trackLayout</w:t>
+            </w:r>
+            <w:proofErr w:type="spellEnd"/>
+          </w:p>
+        </w:tc>
+        <w:tc>
+          <w:tcPr>
+            <w:tcW w:w="2187" w:type="dxa"/>
+          </w:tcPr>
+          <w:p>
+            <w:r>
+              <w:t>String</w:t>
+            </w:r>
+          </w:p>
+        </w:tc>
+        <w:tc>
+          <w:tcPr>
+            <w:tcW w:w="4813" w:type="dxa"/>
+          </w:tcPr>
+          <w:p>
+            <w:r>
+              <w:t xml:space="preserve">Layout </w:t>
+            </w:r>
+            <w:r>
+              <w:t>of track (</w:t>
+            </w:r>
+            <w:proofErr w:type="spellStart"/>
+            <w:r>
+              <w:t>indy</w:t>
+            </w:r>
+            <w:proofErr w:type="spellEnd"/>
+            <w:r>
+              <w:t xml:space="preserve">/GP, </w:t>
+            </w:r>
+            <w:r>
+              <w:t>counter</w:t>
+            </w:r>
+            <w:r>
+              <w:t>clockwise, etc.)</w:t>
+            </w:r>
+          </w:p>
+        </w:tc>
+      </w:tr>
+      <w:tr>
+        <w:tc>
+          <w:tcPr>
+            <w:tcW w:w="2350" w:type="dxa"/>
+          </w:tcPr>
+          <w:p>
+            <w:proofErr w:type="spellStart"/>
+            <w:r>
+              <w:t>trackConditions</w:t>
+            </w:r>
+            <w:proofErr w:type="spellEnd"/>
+          </w:p>
+        </w:tc>
+        <w:tc>
+          <w:tcPr>
+            <w:tcW w:w="2187" w:type="dxa"/>
+          </w:tcPr>
+          <w:p>
+            <w:r>
+              <w:t>String</w:t>
+            </w:r>
+          </w:p>
+        </w:tc>
+        <w:tc>
+          <w:tcPr>
+            <w:tcW w:w="4813" w:type="dxa"/>
+          </w:tcPr>
+          <w:p>
+            <w:r>
+              <w:t>Conditions of track (wet</w:t>
+            </w:r>
+            <w:r>
+              <w:t>/dry, temperature</w:t>
+            </w:r>
+            <w:r>
+              <w:t>)</w:t>
+            </w:r>
+          </w:p>
+        </w:tc>
+      </w:tr>
+      <w:tr>
+        <w:tc>
+          <w:tcPr>
+            <w:tcW w:w="2350" w:type="dxa"/>
+          </w:tcPr>
+          <w:p>
+            <w:proofErr w:type="spellStart"/>
+            <w:r>
+              <w:t>sectorTimes</w:t>
+            </w:r>
+            <w:proofErr w:type="spellEnd"/>
+          </w:p>
+        </w:tc>
+        <w:tc>
+          <w:tcPr>
+            <w:tcW w:w="2187" w:type="dxa"/>
+          </w:tcPr>
+          <w:p>
+            <w:r>
+              <w:t>double</w:t>
+            </w:r>
+          </w:p>
+        </w:tc>
+        <w:tc>
+          <w:tcPr>
+            <w:tcW w:w="4813" w:type="dxa"/>
+          </w:tcPr>
+          <w:p>
+            <w:r>
+              <w:t>Times of drivers per sector on track</w:t>
+            </w:r>
+          </w:p>
+        </w:tc>
+      </w:tr>
+      <w:tr>
+        <w:tc>
+          <w:tcPr>
+            <w:tcW w:w="2350" w:type="dxa"/>
+          </w:tcPr>
+          <w:p>
+            <w:proofErr w:type="spellStart"/>
+            <w:r>
+              <w:t>flagsYellow</w:t>
+            </w:r>
+            <w:proofErr w:type="spellEnd"/>
+          </w:p>
+        </w:tc>
+        <w:tc>
+          <w:tcPr>
+            <w:tcW w:w="2187" w:type="dxa"/>
+          </w:tcPr>
+          <w:p>
+            <w:r>
               <w:t>int</w:t>
             </w:r>
           </w:p>
@@ -588,7 +927,11 @@
           <w:tcPr>
             <w:tcW w:w="4813" w:type="dxa"/>
           </w:tcPr>
-          <w:p/>
+          <w:p>
+            <w:r>
+              <w:t>Quantity of yellow flags (caution on track)</w:t>
+            </w:r>
+          </w:p>
         </w:tc>
       </w:tr>
       <w:tr>
@@ -597,9 +940,11 @@
             <w:tcW w:w="2350" w:type="dxa"/>
           </w:tcPr>
           <w:p>
-            <w:r>
-              <w:t>player2Game1Score</w:t>
-            </w:r>
+            <w:proofErr w:type="spellStart"/>
+            <w:r>
+              <w:t>flagsRed</w:t>
+            </w:r>
+            <w:proofErr w:type="spellEnd"/>
           </w:p>
         </w:tc>
         <w:tc>
@@ -608,7 +953,7 @@
           </w:tcPr>
           <w:p>
             <w:r>
-              <w:t>Int</w:t>
+              <w:t>int</w:t>
             </w:r>
           </w:p>
         </w:tc>
@@ -616,7 +961,11 @@
           <w:tcPr>
             <w:tcW w:w="4813" w:type="dxa"/>
           </w:tcPr>
-          <w:p/>
+          <w:p>
+            <w:r>
+              <w:t>Quantity of red flags (suspend race)</w:t>
+            </w:r>
+          </w:p>
         </w:tc>
       </w:tr>
       <w:tr>
@@ -625,9 +974,11 @@
             <w:tcW w:w="2350" w:type="dxa"/>
           </w:tcPr>
           <w:p>
-            <w:r>
-              <w:t>player1Game2Score</w:t>
-            </w:r>
+            <w:proofErr w:type="spellStart"/>
+            <w:r>
+              <w:t>flagsBlack</w:t>
+            </w:r>
+            <w:proofErr w:type="spellEnd"/>
           </w:p>
         </w:tc>
         <w:tc>
@@ -636,6 +987,49 @@
           </w:tcPr>
           <w:p>
             <w:r>
+              <w:t>i</w:t>
+            </w:r>
+            <w:r>
+              <w:t>nt</w:t>
+            </w:r>
+          </w:p>
+        </w:tc>
+        <w:tc>
+          <w:tcPr>
+            <w:tcW w:w="4813" w:type="dxa"/>
+          </w:tcPr>
+          <w:p>
+            <w:r>
+              <w:t>Quantity of black flags (</w:t>
+            </w:r>
+            <w:r>
+              <w:t xml:space="preserve">driver </w:t>
+            </w:r>
+            <w:r>
+              <w:t>to pit lane)</w:t>
+            </w:r>
+          </w:p>
+        </w:tc>
+      </w:tr>
+      <w:tr>
+        <w:tc>
+          <w:tcPr>
+            <w:tcW w:w="2350" w:type="dxa"/>
+          </w:tcPr>
+          <w:p>
+            <w:proofErr w:type="spellStart"/>
+            <w:r>
+              <w:t>flagsBlue</w:t>
+            </w:r>
+            <w:proofErr w:type="spellEnd"/>
+          </w:p>
+        </w:tc>
+        <w:tc>
+          <w:tcPr>
+            <w:tcW w:w="2187" w:type="dxa"/>
+          </w:tcPr>
+          <w:p>
+            <w:r>
               <w:t>int</w:t>
             </w:r>
           </w:p>
@@ -644,227 +1038,11 @@
           <w:tcPr>
             <w:tcW w:w="4813" w:type="dxa"/>
           </w:tcPr>
-          <w:p/>
-        </w:tc>
-      </w:tr>
-      <w:tr>
-        <w:tc>
-          <w:tcPr>
-            <w:tcW w:w="2350" w:type="dxa"/>
-          </w:tcPr>
-          <w:p>
-            <w:r>
-              <w:t>player2Game2Score</w:t>
-            </w:r>
-          </w:p>
-        </w:tc>
-        <w:tc>
-          <w:tcPr>
-            <w:tcW w:w="2187" w:type="dxa"/>
-          </w:tcPr>
-          <w:p>
-            <w:r>
-              <w:t>Int</w:t>
-            </w:r>
-          </w:p>
-        </w:tc>
-        <w:tc>
-          <w:tcPr>
-            <w:tcW w:w="4813" w:type="dxa"/>
-          </w:tcPr>
-          <w:p/>
-        </w:tc>
-      </w:tr>
-      <w:tr>
-        <w:tc>
-          <w:tcPr>
-            <w:tcW w:w="2350" w:type="dxa"/>
-          </w:tcPr>
-          <w:p>
-            <w:r>
-              <w:t>player1Game3Score</w:t>
-            </w:r>
-          </w:p>
-        </w:tc>
-        <w:tc>
-          <w:tcPr>
-            <w:tcW w:w="2187" w:type="dxa"/>
-          </w:tcPr>
-          <w:p>
-            <w:r>
-              <w:t>int</w:t>
-            </w:r>
-          </w:p>
-        </w:tc>
-        <w:tc>
-          <w:tcPr>
-            <w:tcW w:w="4813" w:type="dxa"/>
-          </w:tcPr>
-          <w:p/>
-        </w:tc>
-      </w:tr>
-      <w:tr>
-        <w:tc>
-          <w:tcPr>
-            <w:tcW w:w="2350" w:type="dxa"/>
-          </w:tcPr>
-          <w:p>
-            <w:r>
-              <w:t>player2Game3Score</w:t>
-            </w:r>
-          </w:p>
-        </w:tc>
-        <w:tc>
-          <w:tcPr>
-            <w:tcW w:w="2187" w:type="dxa"/>
-          </w:tcPr>
-          <w:p>
-            <w:r>
-              <w:t>Int</w:t>
-            </w:r>
-          </w:p>
-        </w:tc>
-        <w:tc>
-          <w:tcPr>
-            <w:tcW w:w="4813" w:type="dxa"/>
-          </w:tcPr>
-          <w:p/>
-        </w:tc>
-      </w:tr>
-      <w:tr>
-        <w:tc>
-          <w:tcPr>
-            <w:tcW w:w="2350" w:type="dxa"/>
-          </w:tcPr>
-          <w:p>
-            <w:r>
-              <w:t>player1Game4Score</w:t>
-            </w:r>
-          </w:p>
-        </w:tc>
-        <w:tc>
-          <w:tcPr>
-            <w:tcW w:w="2187" w:type="dxa"/>
-          </w:tcPr>
-          <w:p>
-            <w:r>
-              <w:t>int</w:t>
-            </w:r>
-          </w:p>
-        </w:tc>
-        <w:tc>
-          <w:tcPr>
-            <w:tcW w:w="4813" w:type="dxa"/>
-          </w:tcPr>
-          <w:p/>
-        </w:tc>
-      </w:tr>
-      <w:tr>
-        <w:tc>
-          <w:tcPr>
-            <w:tcW w:w="2350" w:type="dxa"/>
-          </w:tcPr>
-          <w:p>
-            <w:r>
-              <w:t>player2Game4Score</w:t>
-            </w:r>
-          </w:p>
-        </w:tc>
-        <w:tc>
-          <w:tcPr>
-            <w:tcW w:w="2187" w:type="dxa"/>
-          </w:tcPr>
-          <w:p>
-            <w:r>
-              <w:t>Int</w:t>
-            </w:r>
-          </w:p>
-        </w:tc>
-        <w:tc>
-          <w:tcPr>
-            <w:tcW w:w="4813" w:type="dxa"/>
-          </w:tcPr>
-          <w:p/>
-        </w:tc>
-      </w:tr>
-      <w:tr>
-        <w:tc>
-          <w:tcPr>
-            <w:tcW w:w="2350" w:type="dxa"/>
-          </w:tcPr>
-          <w:p>
-            <w:r>
-              <w:t>player1Game5Score</w:t>
-            </w:r>
-          </w:p>
-        </w:tc>
-        <w:tc>
-          <w:tcPr>
-            <w:tcW w:w="2187" w:type="dxa"/>
-          </w:tcPr>
-          <w:p>
-            <w:r>
-              <w:t>int</w:t>
-            </w:r>
-          </w:p>
-        </w:tc>
-        <w:tc>
-          <w:tcPr>
-            <w:tcW w:w="4813" w:type="dxa"/>
-          </w:tcPr>
-          <w:p/>
-        </w:tc>
-      </w:tr>
-      <w:tr>
-        <w:tc>
-          <w:tcPr>
-            <w:tcW w:w="2350" w:type="dxa"/>
-          </w:tcPr>
-          <w:p>
-            <w:r>
-              <w:t>player2Game5Score</w:t>
-            </w:r>
-          </w:p>
-        </w:tc>
-        <w:tc>
-          <w:tcPr>
-            <w:tcW w:w="2187" w:type="dxa"/>
-          </w:tcPr>
-          <w:p>
-            <w:r>
-              <w:t>Int</w:t>
-            </w:r>
-          </w:p>
-        </w:tc>
-        <w:tc>
-          <w:tcPr>
-            <w:tcW w:w="4813" w:type="dxa"/>
-          </w:tcPr>
-          <w:p/>
-        </w:tc>
-      </w:tr>
-      <w:tr>
-        <w:tc>
-          <w:tcPr>
-            <w:tcW w:w="2350" w:type="dxa"/>
-          </w:tcPr>
-          <w:p>
-            <w:r>
-              <w:t>winnerName</w:t>
-            </w:r>
-          </w:p>
-        </w:tc>
-        <w:tc>
-          <w:tcPr>
-            <w:tcW w:w="2187" w:type="dxa"/>
-          </w:tcPr>
-          <w:p/>
-        </w:tc>
-        <w:tc>
-          <w:tcPr>
-            <w:tcW w:w="4813" w:type="dxa"/>
-          </w:tcPr>
-          <w:p/>
+          <w:p>
+            <w:r>
+              <w:t>Quantity of blue flags (faster car passing)</w:t>
+            </w:r>
+          </w:p>
         </w:tc>
       </w:tr>
     </w:tbl>
@@ -893,7 +1071,13 @@
           <w:p/>
           <w:p>
             <w:r>
-              <w:t>The calculation / processing needed when the player enters a new record will be to determine the winner.  The entry will be analyzed to ensure that one of the players has won three games and the winner will be added to the row of the database.</w:t>
+              <w:t xml:space="preserve">The app will calculate the “delta”, or difference, between drivers’ lap times. The times will be used to determine drivers’ position on the leaderboard. </w:t>
+            </w:r>
+            <w:r>
+              <w:t>The top 3 positions (or “podium”) will be presented to display the winners of the race</w:t>
+            </w:r>
+            <w:r>
+              <w:t>.</w:t>
             </w:r>
           </w:p>
           <w:p/>
@@ -911,7 +1095,11 @@
     </w:p>
     <w:p>
       <w:r>
-        <w:t>Once the document is completed, move the details a repository that you create.  The developer creates the repository for the topic that they will be coding.  Add the other two project group members to the repository</w:t>
+        <w:t xml:space="preserve">Once the document is completed, move the details a repository that you create.  The developer creates the repository for the topic that they will be coding.  Add the other two project group </w:t>
+      </w:r>
+      <w:r>
+        <w:lastRenderedPageBreak/>
+        <w:t>members to the repository</w:t>
       </w:r>
       <w:r>
         <w:t>(or make public)</w:t>
@@ -1539,7 +1727,6 @@
   <w:style w:type="character" w:default="1" w:styleId="DefaultParagraphFont">
     <w:name w:val="Default Paragraph Font"/>
     <w:uiPriority w:val="1"/>
-    <w:semiHidden/>
     <w:unhideWhenUsed/>
   </w:style>
   <w:style w:type="table" w:default="1" w:styleId="TableNormal">

</xml_diff>